<commit_message>
report builder LaTeX support, R support
</commit_message>
<xml_diff>
--- a/backend/labs/rb/scripts/templates/templateT.docx
+++ b/backend/labs/rb/scripts/templates/templateT.docx
@@ -45,19 +45,242 @@
       </w:pPr>
       <w:r>
         <w:rPr/>
-        <w:t>[[^t]]</w:t>
-      </w:r>
-    </w:p>
-    <w:p>
-      <w:pPr>
-        <w:pStyle w:val="Normal"/>
-        <w:bidi w:val="0"/>
-        <w:jc w:val="start"/>
-        <w:rPr/>
-      </w:pPr>
-      <w:r>
-        <w:rPr/>
-        <w:t>[[#a]]</w:t>
+        <w:t>[[% $\frac{-b \pm \sqrt{b^2 - 4ac}}{2a}$]]</w:t>
+      </w:r>
+    </w:p>
+    <w:p>
+      <w:pPr>
+        <w:pStyle w:val="Normal"/>
+        <w:bidi w:val="0"/>
+        <w:jc w:val="start"/>
+        <w:rPr/>
+      </w:pPr>
+      <w:r>
+        <w:rPr/>
+      </w:r>
+    </w:p>
+    <w:p>
+      <w:pPr>
+        <w:pStyle w:val="Normal"/>
+        <w:bidi w:val="0"/>
+        <w:jc w:val="start"/>
+        <w:rPr/>
+      </w:pPr>
+      <w:r>
+        <w:rPr/>
+        <w:t>[[% $\frac{-b \pm \sqrt{b^5 – 8ac}}{2a}$ {“height”:200} ]]</w:t>
+      </w:r>
+    </w:p>
+    <w:p>
+      <w:pPr>
+        <w:pStyle w:val="Normal"/>
+        <w:bidi w:val="0"/>
+        <w:jc w:val="start"/>
+        <w:rPr/>
+      </w:pPr>
+      <w:r>
+        <w:rPr/>
+      </w:r>
+    </w:p>
+    <w:p>
+      <w:pPr>
+        <w:pStyle w:val="Normal"/>
+        <w:bidi w:val="0"/>
+        <w:jc w:val="start"/>
+        <w:rPr/>
+      </w:pPr>
+      <w:r>
+        <w:rPr/>
+      </w:r>
+    </w:p>
+    <w:p>
+      <w:pPr>
+        <w:pStyle w:val="Normal"/>
+        <w:bidi w:val="0"/>
+        <w:jc w:val="start"/>
+        <w:rPr/>
+      </w:pPr>
+      <w:r>
+        <w:rPr/>
+        <w:t>[[#a orderBy</w:t>
+      </w:r>
+      <w:r>
+        <w:rPr/>
+        <w:t>=</w:t>
+      </w:r>
+      <w:r>
+        <w:rPr/>
+        <w:t>jmeno]]</w:t>
+      </w:r>
+    </w:p>
+    <w:p>
+      <w:pPr>
+        <w:pStyle w:val="Normal"/>
+        <w:bidi w:val="0"/>
+        <w:jc w:val="start"/>
+        <w:rPr/>
+      </w:pPr>
+      <w:r>
+        <w:rPr/>
+        <w:t>[[ jmeno ]]</w:t>
+      </w:r>
+    </w:p>
+    <w:p>
+      <w:pPr>
+        <w:pStyle w:val="Normal"/>
+        <w:bidi w:val="0"/>
+        <w:jc w:val="start"/>
+        <w:rPr/>
+      </w:pPr>
+      <w:r>
+        <w:rPr/>
+        <w:t>[[ prijmeni ]]</w:t>
+      </w:r>
+    </w:p>
+    <w:p>
+      <w:pPr>
+        <w:pStyle w:val="Normal"/>
+        <w:bidi w:val="0"/>
+        <w:jc w:val="start"/>
+        <w:rPr/>
+      </w:pPr>
+      <w:r>
+        <w:rPr/>
+        <w:t>[[ foto ]]</w:t>
+      </w:r>
+    </w:p>
+    <w:p>
+      <w:pPr>
+        <w:pStyle w:val="Normal"/>
+        <w:bidi w:val="0"/>
+        <w:jc w:val="start"/>
+        <w:rPr/>
+      </w:pPr>
+      <w:r>
+        <w:rPr/>
+        <w:t xml:space="preserve">[[% img filename </w:t>
+      </w:r>
+      <w:r>
+        <w:rPr/>
+        <w:t>= “</w:t>
+      </w:r>
+      <w:r>
+        <w:rPr/>
+        <w:t>.foto” , width</w:t>
+      </w:r>
+      <w:r>
+        <w:rPr/>
+        <w:t>=2</w:t>
+      </w:r>
+      <w:r>
+        <w:rPr/>
+        <w:t xml:space="preserve">00 </w:t>
+      </w:r>
+      <w:r>
+        <w:rPr/>
+        <w:t>height = 230</w:t>
+      </w:r>
+      <w:r>
+        <w:rPr/>
+        <w:t>]]</w:t>
+      </w:r>
+    </w:p>
+    <w:p>
+      <w:pPr>
+        <w:pStyle w:val="Normal"/>
+        <w:bidi w:val="0"/>
+        <w:jc w:val="start"/>
+        <w:rPr/>
+      </w:pPr>
+      <w:r>
+        <w:rPr/>
+      </w:r>
+    </w:p>
+    <w:p>
+      <w:pPr>
+        <w:pStyle w:val="Normal"/>
+        <w:bidi w:val="0"/>
+        <w:jc w:val="start"/>
+        <w:rPr/>
+      </w:pPr>
+      <w:r>
+        <w:rPr/>
+      </w:r>
+    </w:p>
+    <w:p>
+      <w:pPr>
+        <w:pStyle w:val="Normal"/>
+        <w:bidi w:val="0"/>
+        <w:jc w:val="start"/>
+        <w:rPr/>
+      </w:pPr>
+      <w:r>
+        <w:rPr/>
+      </w:r>
+    </w:p>
+    <w:p>
+      <w:pPr>
+        <w:pStyle w:val="Normal"/>
+        <w:bidi w:val="0"/>
+        <w:jc w:val="start"/>
+        <w:rPr/>
+      </w:pPr>
+      <w:r>
+        <w:rPr/>
+      </w:r>
+    </w:p>
+    <w:p>
+      <w:pPr>
+        <w:pStyle w:val="Normal"/>
+        <w:bidi w:val="0"/>
+        <w:jc w:val="start"/>
+        <w:rPr/>
+      </w:pPr>
+      <w:r>
+        <w:rPr/>
+      </w:r>
+    </w:p>
+    <w:p>
+      <w:pPr>
+        <w:pStyle w:val="Normal"/>
+        <w:bidi w:val="0"/>
+        <w:jc w:val="start"/>
+        <w:rPr/>
+      </w:pPr>
+      <w:r>
+        <w:rPr/>
+        <w:t>[[/a orderBy</w:t>
+      </w:r>
+      <w:r>
+        <w:rPr/>
+        <w:t>=</w:t>
+      </w:r>
+      <w:r>
+        <w:rPr/>
+        <w:t>jmeno]]</w:t>
+      </w:r>
+    </w:p>
+    <w:p>
+      <w:pPr>
+        <w:pStyle w:val="Normal"/>
+        <w:bidi w:val="0"/>
+        <w:jc w:val="start"/>
+        <w:rPr/>
+      </w:pPr>
+      <w:r>
+        <w:rPr/>
+      </w:r>
+    </w:p>
+    <w:p>
+      <w:pPr>
+        <w:pStyle w:val="Normal"/>
+        <w:bidi w:val="0"/>
+        <w:jc w:val="start"/>
+        <w:rPr/>
+      </w:pPr>
+      <w:r>
+        <w:rPr/>
+        <w:t>[[#a{“orderBy”:”jmeno desc”}]]</w:t>
       </w:r>
     </w:p>
     <w:p>
@@ -93,42 +316,64 @@
       </w:pPr>
       <w:r>
         <w:rPr/>
-        <w:t>[[/a]]</w:t>
-      </w:r>
-    </w:p>
-    <w:p>
-      <w:pPr>
-        <w:pStyle w:val="Normal"/>
-        <w:bidi w:val="0"/>
-        <w:jc w:val="start"/>
-        <w:rPr/>
-      </w:pPr>
-      <w:r>
-        <w:rPr/>
-        <w:t>[[/t]]</w:t>
-      </w:r>
-    </w:p>
-    <w:p>
-      <w:pPr>
-        <w:pStyle w:val="Normal"/>
-        <w:bidi w:val="0"/>
-        <w:jc w:val="start"/>
-        <w:rPr/>
-      </w:pPr>
-      <w:r>
-        <w:rPr/>
-      </w:r>
-    </w:p>
-    <w:p>
-      <w:pPr>
-        <w:pStyle w:val="Normal"/>
-        <w:bidi w:val="0"/>
-        <w:jc w:val="start"/>
-        <w:rPr/>
-      </w:pPr>
-      <w:r>
-        <w:rPr/>
-        <w:t>[[t]]</w:t>
+        <w:t>[[foto]]</w:t>
+      </w:r>
+    </w:p>
+    <w:p>
+      <w:pPr>
+        <w:pStyle w:val="Normal"/>
+        <w:bidi w:val="0"/>
+        <w:jc w:val="start"/>
+        <w:rPr/>
+      </w:pPr>
+      <w:r>
+        <w:rPr/>
+        <w:t>[[%img{“filename”:”.foto”,”width”:100, “height”:100}]]</w:t>
+      </w:r>
+    </w:p>
+    <w:p>
+      <w:pPr>
+        <w:pStyle w:val="Normal"/>
+        <w:bidi w:val="0"/>
+        <w:jc w:val="start"/>
+        <w:rPr/>
+      </w:pPr>
+      <w:r>
+        <w:rPr/>
+      </w:r>
+    </w:p>
+    <w:p>
+      <w:pPr>
+        <w:pStyle w:val="Normal"/>
+        <w:bidi w:val="0"/>
+        <w:jc w:val="start"/>
+        <w:rPr/>
+      </w:pPr>
+      <w:r>
+        <w:rPr/>
+      </w:r>
+    </w:p>
+    <w:p>
+      <w:pPr>
+        <w:pStyle w:val="Normal"/>
+        <w:bidi w:val="0"/>
+        <w:jc w:val="start"/>
+        <w:rPr/>
+      </w:pPr>
+      <w:r>
+        <w:rPr/>
+        <w:t>[[/a{“orderBy”:”jmeno desc”}]]</w:t>
+      </w:r>
+    </w:p>
+    <w:p>
+      <w:pPr>
+        <w:pStyle w:val="Normal"/>
+        <w:bidi w:val="0"/>
+        <w:jc w:val="start"/>
+        <w:rPr/>
+      </w:pPr>
+      <w:r>
+        <w:rPr/>
       </w:r>
     </w:p>
     <w:p>
@@ -287,6 +532,7 @@
       <w:pgNumType w:fmt="decimal"/>
       <w:formProt w:val="false"/>
       <w:textDirection w:val="lrTb"/>
+      <w:docGrid w:type="default" w:linePitch="100" w:charSpace="0"/>
     </w:sectPr>
   </w:body>
 </w:document>
@@ -306,7 +552,6 @@
     </w:rPrDefault>
     <w:pPrDefault>
       <w:pPr>
-        <w:widowControl/>
         <w:suppressAutoHyphens w:val="true"/>
       </w:pPr>
     </w:pPrDefault>
@@ -316,7 +561,10 @@
     <w:qFormat/>
     <w:pPr>
       <w:widowControl/>
+      <w:suppressAutoHyphens w:val="true"/>
       <w:bidi w:val="0"/>
+      <w:spacing w:before="0" w:after="0"/>
+      <w:jc w:val="start"/>
     </w:pPr>
     <w:rPr>
       <w:rFonts w:ascii="Liberation Serif" w:hAnsi="Liberation Serif" w:eastAsia="Noto Serif CJK SC" w:cs="Noto Sans Devanagari"/>

</xml_diff>

<commit_message>
added img default params in environment.json support
</commit_message>
<xml_diff>
--- a/backend/labs/rb/scripts/templates/templateT.docx
+++ b/backend/labs/rb/scripts/templates/templateT.docx
@@ -68,49 +68,41 @@
       </w:pPr>
       <w:r>
         <w:rPr/>
-        <w:t>[[% $\frac{-b \pm \sqrt{b^5 – 8ac}}{2a}$ {“height”:200} ]]</w:t>
-      </w:r>
-    </w:p>
-    <w:p>
-      <w:pPr>
-        <w:pStyle w:val="Normal"/>
-        <w:bidi w:val="0"/>
-        <w:jc w:val="start"/>
-        <w:rPr/>
-      </w:pPr>
-      <w:r>
-        <w:rPr/>
-      </w:r>
-    </w:p>
-    <w:p>
-      <w:pPr>
-        <w:pStyle w:val="Normal"/>
-        <w:bidi w:val="0"/>
-        <w:jc w:val="start"/>
-        <w:rPr/>
-      </w:pPr>
-      <w:r>
-        <w:rPr/>
-      </w:r>
-    </w:p>
-    <w:p>
-      <w:pPr>
-        <w:pStyle w:val="Normal"/>
-        <w:bidi w:val="0"/>
-        <w:jc w:val="start"/>
-        <w:rPr/>
-      </w:pPr>
-      <w:r>
-        <w:rPr/>
-        <w:t>[[#a orderBy</w:t>
-      </w:r>
-      <w:r>
-        <w:rPr/>
-        <w:t>=</w:t>
-      </w:r>
-      <w:r>
-        <w:rPr/>
-        <w:t>jmeno]]</w:t>
+        <w:t>[[% $\frac{-b \pm \sqrt{b^5 – 8ac}}{2a}$ {“height”:20} ]]</w:t>
+      </w:r>
+    </w:p>
+    <w:p>
+      <w:pPr>
+        <w:pStyle w:val="Normal"/>
+        <w:bidi w:val="0"/>
+        <w:jc w:val="start"/>
+        <w:rPr/>
+      </w:pPr>
+      <w:r>
+        <w:rPr/>
+      </w:r>
+    </w:p>
+    <w:p>
+      <w:pPr>
+        <w:pStyle w:val="Normal"/>
+        <w:bidi w:val="0"/>
+        <w:jc w:val="start"/>
+        <w:rPr/>
+      </w:pPr>
+      <w:r>
+        <w:rPr/>
+      </w:r>
+    </w:p>
+    <w:p>
+      <w:pPr>
+        <w:pStyle w:val="Normal"/>
+        <w:bidi w:val="0"/>
+        <w:jc w:val="start"/>
+        <w:rPr/>
+      </w:pPr>
+      <w:r>
+        <w:rPr/>
+        <w:t>[[#a orderBy=jmeno]]</w:t>
       </w:r>
     </w:p>
     <w:p>
@@ -158,106 +150,74 @@
       </w:pPr>
       <w:r>
         <w:rPr/>
-        <w:t xml:space="preserve">[[% img filename </w:t>
-      </w:r>
-      <w:r>
-        <w:rPr/>
-        <w:t>= “</w:t>
-      </w:r>
-      <w:r>
-        <w:rPr/>
-        <w:t>.foto” , width</w:t>
-      </w:r>
-      <w:r>
-        <w:rPr/>
-        <w:t>=2</w:t>
-      </w:r>
-      <w:r>
-        <w:rPr/>
-        <w:t xml:space="preserve">00 </w:t>
-      </w:r>
-      <w:r>
-        <w:rPr/>
-        <w:t>height = 230</w:t>
-      </w:r>
-      <w:r>
-        <w:rPr/>
-        <w:t>]]</w:t>
-      </w:r>
-    </w:p>
-    <w:p>
-      <w:pPr>
-        <w:pStyle w:val="Normal"/>
-        <w:bidi w:val="0"/>
-        <w:jc w:val="start"/>
-        <w:rPr/>
-      </w:pPr>
-      <w:r>
-        <w:rPr/>
-      </w:r>
-    </w:p>
-    <w:p>
-      <w:pPr>
-        <w:pStyle w:val="Normal"/>
-        <w:bidi w:val="0"/>
-        <w:jc w:val="start"/>
-        <w:rPr/>
-      </w:pPr>
-      <w:r>
-        <w:rPr/>
-      </w:r>
-    </w:p>
-    <w:p>
-      <w:pPr>
-        <w:pStyle w:val="Normal"/>
-        <w:bidi w:val="0"/>
-        <w:jc w:val="start"/>
-        <w:rPr/>
-      </w:pPr>
-      <w:r>
-        <w:rPr/>
-      </w:r>
-    </w:p>
-    <w:p>
-      <w:pPr>
-        <w:pStyle w:val="Normal"/>
-        <w:bidi w:val="0"/>
-        <w:jc w:val="start"/>
-        <w:rPr/>
-      </w:pPr>
-      <w:r>
-        <w:rPr/>
-      </w:r>
-    </w:p>
-    <w:p>
-      <w:pPr>
-        <w:pStyle w:val="Normal"/>
-        <w:bidi w:val="0"/>
-        <w:jc w:val="start"/>
-        <w:rPr/>
-      </w:pPr>
-      <w:r>
-        <w:rPr/>
-      </w:r>
-    </w:p>
-    <w:p>
-      <w:pPr>
-        <w:pStyle w:val="Normal"/>
-        <w:bidi w:val="0"/>
-        <w:jc w:val="start"/>
-        <w:rPr/>
-      </w:pPr>
-      <w:r>
-        <w:rPr/>
-        <w:t>[[/a orderBy</w:t>
-      </w:r>
-      <w:r>
-        <w:rPr/>
-        <w:t>=</w:t>
-      </w:r>
-      <w:r>
-        <w:rPr/>
-        <w:t>jmeno]]</w:t>
+        <w:t>[[% img filename = “.foto” , width=200 height = 230]]</w:t>
+      </w:r>
+    </w:p>
+    <w:p>
+      <w:pPr>
+        <w:pStyle w:val="Normal"/>
+        <w:bidi w:val="0"/>
+        <w:jc w:val="start"/>
+        <w:rPr/>
+      </w:pPr>
+      <w:r>
+        <w:rPr/>
+      </w:r>
+    </w:p>
+    <w:p>
+      <w:pPr>
+        <w:pStyle w:val="Normal"/>
+        <w:bidi w:val="0"/>
+        <w:jc w:val="start"/>
+        <w:rPr/>
+      </w:pPr>
+      <w:r>
+        <w:rPr/>
+      </w:r>
+    </w:p>
+    <w:p>
+      <w:pPr>
+        <w:pStyle w:val="Normal"/>
+        <w:bidi w:val="0"/>
+        <w:jc w:val="start"/>
+        <w:rPr/>
+      </w:pPr>
+      <w:r>
+        <w:rPr/>
+      </w:r>
+    </w:p>
+    <w:p>
+      <w:pPr>
+        <w:pStyle w:val="Normal"/>
+        <w:bidi w:val="0"/>
+        <w:jc w:val="start"/>
+        <w:rPr/>
+      </w:pPr>
+      <w:r>
+        <w:rPr/>
+      </w:r>
+    </w:p>
+    <w:p>
+      <w:pPr>
+        <w:pStyle w:val="Normal"/>
+        <w:bidi w:val="0"/>
+        <w:jc w:val="start"/>
+        <w:rPr/>
+      </w:pPr>
+      <w:r>
+        <w:rPr/>
+      </w:r>
+    </w:p>
+    <w:p>
+      <w:pPr>
+        <w:pStyle w:val="Normal"/>
+        <w:bidi w:val="0"/>
+        <w:jc w:val="start"/>
+        <w:rPr/>
+      </w:pPr>
+      <w:r>
+        <w:rPr/>
+        <w:t>[[/a orderBy=jmeno]]</w:t>
       </w:r>
     </w:p>
     <w:p>

</xml_diff>